<commit_message>
Gera o Kit Comida Primeiro de novo nas cores do congresso
Os 16 PDFs, a carta em Word, as cinco imagens do carrossel, o carrossel
editável e as miniaturas passam a usar a paleta do 42º Congresso
Brasileiro de Pediatria, com a faixa dourada do modelo no topo de cada
página e de cada cartão. A faixa fica dentro da margem superior, sem
alterar a diagramação: o texto e o número de páginas de cada PDF e o
texto da carta conferem com a versão anterior.

Fontes atualizadas: base.css, carrossel/carrossel.py e gen_docx.py.
</commit_message>
<xml_diff>
--- a/kit-comida-primeiro/docs/materiais/18-carta-ao-treinador-e-a-escola.docx
+++ b/kit-comida-primeiro/docs/materiais/18-carta-ao-treinador-e-a-escola.docx
@@ -8,7 +8,7 @@
       </w:pPr>
       <w:r>
         <w:rPr>
-          <w:color w:val="4A7613"/>
+          <w:color w:val="4F6F0F"/>
         </w:rPr>
         <w:t>[Cidade]</w:t>
       </w:r>
@@ -17,7 +17,7 @@
       </w:r>
       <w:r>
         <w:rPr>
-          <w:color w:val="4A7613"/>
+          <w:color w:val="4F6F0F"/>
         </w:rPr>
         <w:t>[data]</w:t>
       </w:r>
@@ -29,7 +29,7 @@
       </w:pPr>
       <w:r>
         <w:rPr>
-          <w:color w:val="4A7613"/>
+          <w:color w:val="4F6F0F"/>
         </w:rPr>
         <w:t>[Nome do serviço ou consultório]</w:t>
       </w:r>
@@ -40,7 +40,7 @@
       </w:r>
       <w:r>
         <w:rPr>
-          <w:color w:val="4A7613"/>
+          <w:color w:val="4F6F0F"/>
         </w:rPr>
         <w:t>[nome do treinador ou da coordenação]</w:t>
       </w:r>
@@ -54,7 +54,7 @@
       </w:r>
       <w:r>
         <w:rPr>
-          <w:color w:val="4A7613"/>
+          <w:color w:val="4F6F0F"/>
         </w:rPr>
         <w:t>[nome do atleta]</w:t>
       </w:r>
@@ -63,7 +63,7 @@
       </w:r>
       <w:r>
         <w:rPr>
-          <w:color w:val="4A7613"/>
+          <w:color w:val="4F6F0F"/>
         </w:rPr>
         <w:t>[idade]</w:t>
       </w:r>
@@ -72,7 +72,7 @@
       </w:r>
       <w:r>
         <w:rPr>
-          <w:color w:val="4A7613"/>
+          <w:color w:val="4F6F0F"/>
         </w:rPr>
         <w:t>[modalidade]</w:t>
       </w:r>
@@ -87,7 +87,7 @@
       <w:r>
         <w:rPr>
           <w:b/>
-          <w:color w:val="1F2552"/>
+          <w:color w:val="252A5A"/>
         </w:rPr>
         <w:t xml:space="preserve">1. Comida primeiro. </w:t>
       </w:r>
@@ -96,7 +96,7 @@
       </w:r>
       <w:r>
         <w:rPr>
-          <w:color w:val="4A7613"/>
+          <w:color w:val="4F6F0F"/>
           <w:sz w:val="16"/>
           <w:vertAlign w:val="superscript"/>
         </w:rPr>
@@ -107,7 +107,7 @@
       </w:r>
       <w:r>
         <w:rPr>
-          <w:color w:val="4A7613"/>
+          <w:color w:val="4F6F0F"/>
           <w:sz w:val="16"/>
           <w:vertAlign w:val="superscript"/>
         </w:rPr>
@@ -124,7 +124,7 @@
       <w:r>
         <w:rPr>
           <w:b/>
-          <w:color w:val="1F2552"/>
+          <w:color w:val="252A5A"/>
         </w:rPr>
         <w:t xml:space="preserve">2. Suplementos fora da rotina da equipe. </w:t>
       </w:r>
@@ -133,7 +133,7 @@
       </w:r>
       <w:r>
         <w:rPr>
-          <w:color w:val="4A7613"/>
+          <w:color w:val="4F6F0F"/>
           <w:sz w:val="16"/>
           <w:vertAlign w:val="superscript"/>
         </w:rPr>
@@ -144,7 +144,7 @@
       </w:r>
       <w:r>
         <w:rPr>
-          <w:color w:val="4A7613"/>
+          <w:color w:val="4F6F0F"/>
           <w:sz w:val="16"/>
           <w:vertAlign w:val="superscript"/>
         </w:rPr>
@@ -155,7 +155,7 @@
       </w:r>
       <w:r>
         <w:rPr>
-          <w:color w:val="4A7613"/>
+          <w:color w:val="4F6F0F"/>
           <w:sz w:val="16"/>
           <w:vertAlign w:val="superscript"/>
         </w:rPr>
@@ -172,7 +172,7 @@
       <w:r>
         <w:rPr>
           <w:b/>
-          <w:color w:val="1F2552"/>
+          <w:color w:val="252A5A"/>
         </w:rPr>
         <w:t xml:space="preserve">3. Sem comentários sobre peso e corpo. </w:t>
       </w:r>
@@ -181,7 +181,7 @@
       </w:r>
       <w:r>
         <w:rPr>
-          <w:color w:val="4A7613"/>
+          <w:color w:val="4F6F0F"/>
           <w:sz w:val="16"/>
           <w:vertAlign w:val="superscript"/>
         </w:rPr>
@@ -192,7 +192,7 @@
       </w:r>
       <w:r>
         <w:rPr>
-          <w:color w:val="4A7613"/>
+          <w:color w:val="4F6F0F"/>
           <w:sz w:val="16"/>
           <w:vertAlign w:val="superscript"/>
         </w:rPr>
@@ -209,7 +209,7 @@
       <w:r>
         <w:rPr>
           <w:b/>
-          <w:color w:val="1F2552"/>
+          <w:color w:val="252A5A"/>
         </w:rPr>
         <w:t xml:space="preserve">4. Água à vontade e pausas para beber. </w:t>
       </w:r>
@@ -218,7 +218,7 @@
       </w:r>
       <w:r>
         <w:rPr>
-          <w:color w:val="4A7613"/>
+          <w:color w:val="4F6F0F"/>
           <w:sz w:val="16"/>
           <w:vertAlign w:val="superscript"/>
         </w:rPr>
@@ -229,7 +229,7 @@
       </w:r>
       <w:r>
         <w:rPr>
-          <w:color w:val="4A7613"/>
+          <w:color w:val="4F6F0F"/>
           <w:sz w:val="16"/>
           <w:vertAlign w:val="superscript"/>
         </w:rPr>
@@ -246,7 +246,7 @@
       <w:r>
         <w:rPr>
           <w:b/>
-          <w:color w:val="1F2552"/>
+          <w:color w:val="252A5A"/>
         </w:rPr>
         <w:t xml:space="preserve">5. Avisem a família se notarem </w:t>
       </w:r>
@@ -255,7 +255,7 @@
       </w:r>
       <w:r>
         <w:rPr>
-          <w:color w:val="4A7613"/>
+          <w:color w:val="4F6F0F"/>
           <w:sz w:val="16"/>
           <w:vertAlign w:val="superscript"/>
         </w:rPr>
@@ -271,7 +271,7 @@
       </w:r>
       <w:r>
         <w:rPr>
-          <w:color w:val="4A7613"/>
+          <w:color w:val="4F6F0F"/>
           <w:sz w:val="16"/>
           <w:vertAlign w:val="superscript"/>
         </w:rPr>
@@ -297,7 +297,7 @@
     <w:p>
       <w:r>
         <w:rPr>
-          <w:color w:val="4A7613"/>
+          <w:color w:val="4F6F0F"/>
         </w:rPr>
         <w:t>[Nome do pediatra]</w:t>
       </w:r>
@@ -308,7 +308,7 @@
       </w:r>
       <w:r>
         <w:rPr>
-          <w:color w:val="4A7613"/>
+          <w:color w:val="4F6F0F"/>
         </w:rPr>
         <w:t>[número e estado]</w:t>
       </w:r>
@@ -317,7 +317,7 @@
       </w:r>
       <w:r>
         <w:rPr>
-          <w:color w:val="4A7613"/>
+          <w:color w:val="4F6F0F"/>
         </w:rPr>
         <w:t>[telefone ou e-mail profissional]</w:t>
       </w:r>
@@ -330,7 +330,7 @@
       <w:r>
         <w:rPr>
           <w:b/>
-          <w:color w:val="4A7613"/>
+          <w:color w:val="4F6F0F"/>
           <w:sz w:val="18"/>
         </w:rPr>
         <w:t>Fontes</w:t>
@@ -342,7 +342,7 @@
       </w:pPr>
       <w:r>
         <w:rPr>
-          <w:color w:val="5A6072"/>
+          <w:color w:val="5D6386"/>
           <w:sz w:val="16"/>
         </w:rPr>
         <w:t>1. Desbrow B. Youth athlete development and nutrition. Sports Med. 2021;51(Suppl 1):3-12. doi:10.1007/s40279-021-01534-6</w:t>
@@ -354,7 +354,7 @@
       </w:pPr>
       <w:r>
         <w:rPr>
-          <w:color w:val="5A6072"/>
+          <w:color w:val="5D6386"/>
           <w:sz w:val="16"/>
         </w:rPr>
         <w:t>2. Collins J, Maughan RJ, Gleeson M, Bilsborough J, Jeukendrup A, Morton JP, et al. UEFA expert group statement on nutrition in elite football. Current evidence to inform practical recommendations and guide future research. Br J Sports Med. 2021;55(8):416. doi:10.1136/bjsports-2019-101961</w:t>
@@ -366,7 +366,7 @@
       </w:pPr>
       <w:r>
         <w:rPr>
-          <w:color w:val="5A6072"/>
+          <w:color w:val="5D6386"/>
           <w:sz w:val="16"/>
         </w:rPr>
         <w:t>3. Brasil. Agência Nacional de Vigilância Sanitária. Instrução Normativa nº 28, de 26 de julho de 2018. Estabelece as listas de constituintes, de limites de uso, de alegações e de rotulagem complementar dos suplementos alimentares. Diário Oficial da União. 2018 jul 27; Seção 1. Disponível em: https://bvsms.saude.gov.br/bvs/saudelegis/anvisa/2018/int0028_26_07_2018.pdf</w:t>
@@ -378,7 +378,7 @@
       </w:pPr>
       <w:r>
         <w:rPr>
-          <w:color w:val="5A6072"/>
+          <w:color w:val="5D6386"/>
           <w:sz w:val="16"/>
         </w:rPr>
         <w:t>4. Brasil. Agência Nacional de Vigilância Sanitária. Instrução Normativa nº 373, de 5 de junho de 2025. Altera a Instrução Normativa nº 28, de 26 de julho de 2018, que estabelece as listas de constituintes, de limites de uso, de alegações e de rotulagem complementar dos suplementos alimentares. Diário Oficial da União. 2025 jun 9; Seção 1.</w:t>
@@ -390,7 +390,7 @@
       </w:pPr>
       <w:r>
         <w:rPr>
-          <w:color w:val="5A6072"/>
+          <w:color w:val="5D6386"/>
           <w:sz w:val="16"/>
         </w:rPr>
         <w:t>5. Geyer H, Parr MK, Mareck U, Reinhart U, Schrader Y, Schänzer W. Analysis of non-hormonal nutritional supplements for anabolic-androgenic steroids: results of an international study. Int J Sports Med. 2004;25(2):124-9. doi:10.1055/s-2004-819955</w:t>
@@ -402,7 +402,7 @@
       </w:pPr>
       <w:r>
         <w:rPr>
-          <w:color w:val="5A6072"/>
+          <w:color w:val="5D6386"/>
           <w:sz w:val="16"/>
         </w:rPr>
         <w:t>6. Brasil. Autoridade Brasileira de Controle de Dopagem. Perguntas frequentes [Internet]. Brasília: ABCD; [citado 2026 out 11]. Disponível em: https://www.gov.br/abcd/pt-br/acesso-a-informacao/perguntas-frequentes</w:t>
@@ -414,7 +414,7 @@
       </w:pPr>
       <w:r>
         <w:rPr>
-          <w:color w:val="5A6072"/>
+          <w:color w:val="5D6386"/>
           <w:sz w:val="16"/>
         </w:rPr>
         <w:t>7. Mountjoy M, Ackerman KE, Bailey DM, Burke LM, Constantini N, Hackney AC, et al. 2023 International Olympic Committee's (IOC) consensus statement on Relative Energy Deficiency in Sport (REDs). Br J Sports Med. 2023;57(17):1073-97. doi:10.1136/bjsports-2023-106994</w:t>
@@ -426,7 +426,7 @@
       </w:pPr>
       <w:r>
         <w:rPr>
-          <w:color w:val="5A6072"/>
+          <w:color w:val="5D6386"/>
           <w:sz w:val="16"/>
         </w:rPr>
         <w:t>8. American Academy of Pediatrics Committee on Nutrition; Council on Sports Medicine and Fitness. Sports drinks and energy drinks for children and adolescents: are they appropriate? Pediatrics. 2011;127(6):1182-9. doi:10.1542/peds.2011-0965</w:t>
@@ -438,7 +438,7 @@
       </w:pPr>
       <w:r>
         <w:rPr>
-          <w:color w:val="5A6072"/>
+          <w:color w:val="5D6386"/>
           <w:sz w:val="16"/>
         </w:rPr>
         <w:t>9. LaBotz M, Griesemer BA; Council on Sports Medicine and Fitness. Use of performance-enhancing substances. Pediatrics. 2016;138(1):e20161300. doi:10.1542/peds.2016-1300</w:t>
@@ -450,7 +450,7 @@
       </w:pPr>
       <w:r>
         <w:rPr>
-          <w:color w:val="5A6072"/>
+          <w:color w:val="5D6386"/>
           <w:sz w:val="16"/>
         </w:rPr>
         <w:t>10. Elliot DL, Goldberg L, Moe EL, Defrancesco CA, Durham MB, Hix-Small H. Preventing substance use and disordered eating: initial outcomes of the ATHENA (athletes targeting healthy exercise and nutrition alternatives) program. Arch Pediatr Adolesc Med. 2004;158(11):1043-9. doi:10.1001/archpedi.158.11.1043</w:t>
@@ -475,7 +475,7 @@
     </w:pPr>
     <w:r>
       <w:rPr>
-        <w:color w:val="5A6072"/>
+        <w:color w:val="5D6386"/>
         <w:sz w:val="14"/>
       </w:rPr>
       <w:t>Modelo do Kit Comida Primeiro. Aula “Creatina e Whey Protein: modismo inadequado”, 42º Congresso Brasileiro de Pediatria, 2026. Getúlio Bernardo Morato Filho, Escola Superior de Ciências da Saúde, Brasília, DF.</w:t>

</xml_diff>